<commit_message>
V25: state Stage-3 implied-consent procedure in 3.4; mirror in Paper 3
Per the author's account: distribution e-mails explained the purpose of
the game and questionnaire and the use of replies; participation was
voluntary and unpaid; returning the results file and responses
constituted consent; no written instrument was administered
(acknowledged limitation); identities separated from analysed records.
Paper 3 R3 gains the matching III.C statement and a VII limitation
entry.

Co-Authored-By: Claude Fable 5 <noreply@anthropic.com>
Claude-Session: https://claude.ai/code/session_01KoT3i8geZspYBMMKVYJUTG
</commit_message>
<xml_diff>
--- a/docs/papers/Paper3_R3_Aligned_V24.docx
+++ b/docs/papers/Paper3_R3_Aligned_V24.docx
@@ -142,7 +142,7 @@
     </w:p>
     <w:p>
       <w:r>
-        <w:t>One hundred and twenty community-dwelling adults aged 25-80 were recruited through the authors' Hong Kong-based networks — work contacts, a charity community network, university support channels and working peers in medical centres: 38 aged 25-44, 41 aged 45-64 and 41 aged 65-80; 48 men and 72 women; all reported high-school education or above. Recruitment materials described a coordination challenge and used no medical or fall-prevention vocabulary. Recruiting three age bands builds the comparison group into the study and licenses a second null hypothesis, H0-age: that under the decoupled condition there is no difference between age groups. Data collection is complete: each participant returned, by e-mail, the results file logged by the HTML build (including the session score and game-logged data) together with their questionnaire responses. This paper reports the preliminary aggregate record compiled from those returns; participant-level compilation continues beyond it.</w:t>
+        <w:t>One hundred and twenty community-dwelling adults aged 25-80 were recruited through the authors' Hong Kong-based networks — work contacts, a charity community network, university support channels and working peers in medical centres: 38 aged 25-44, 41 aged 45-64 and 41 aged 65-80; 48 men and 72 women; all reported high-school education or above. Recruitment materials described a coordination challenge and used no medical or fall-prevention vocabulary. Recruiting three age bands builds the comparison group into the study and licenses a second null hypothesis, H0-age: that under the decoupled condition there is no difference between age groups. Data collection is complete: each participant returned, by e-mail, the results file logged by the HTML build (including the session score and game-logged data) together with their questionnaire responses. This paper reports the preliminary aggregate record compiled from those returns; participant-level compilation continues beyond it. Participation was voluntary and unpaid, by informed, implied consent: the distribution e-mails explained the purpose of the game and questionnaire and the use of replies, and returning the results file and responses constituted consent; no written consent instrument was administered, which is acknowledged in Section VII. Identities were separated from the analysed records, which retain only a participant code, age band, gender and education.</w:t>
       </w:r>
     </w:p>
     <w:p>
@@ -1159,7 +1159,7 @@
     </w:p>
     <w:p>
       <w:r>
-        <w:t>The comparison with [2] is between-cycle and between-cohort, without randomisation; the decoupling is a multi-component package that includes a change of platform, input device, setting and supervision (an e-mailed HTML build played unsupervised on participants' own computers, rather than the supervised pressure-panel station of [2]); the proposed mechanisms (endowment, mental accounting, stereotype threat) were not directly measured; regular-use intention is stated, not longitudinal behaviour; this paper reports the preliminary aggregate record compiled from participants' e-mailed returns, with participant-level compilation continuing beyond it; input device varied by participant and was not centrally standardised; remote unsupervised play means session conditions were not controlled; participants were volunteers in Chinese-cultural settings, and generalisation beyond these contexts is untested; and no clinical telemetry was collected, so no claim about clinical outcomes under decoupling is made.</w:t>
+        <w:t>The comparison with [2] is between-cycle and between-cohort, without randomisation; the decoupling is a multi-component package that includes a change of platform, input device, setting and supervision (an e-mailed HTML build played unsupervised on participants' own computers, rather than the supervised pressure-panel station of [2]); the proposed mechanisms (endowment, mental accounting, stereotype threat) were not directly measured; regular-use intention is stated, not longitudinal behaviour; this paper reports the preliminary aggregate record compiled from participants' e-mailed returns, with participant-level compilation continuing beyond it; input device varied by participant and was not centrally standardised; remote unsupervised play means session conditions were not controlled; participants were volunteers in Chinese-cultural settings, and generalisation beyond these contexts is untested; consent was informed but implied rather than written; and no clinical telemetry was collected, so no claim about clinical outcomes under decoupling is made.</w:t>
       </w:r>
     </w:p>
     <w:p>

</xml_diff>

<commit_message>
Paper 3: add Figures 1-3 (game build, participant flow, age gradient)
Figure 1 reuses the archived Alpine_Coordination_Game_Stage3_v2.html
composite (five staged difficulty levels); Figure 2 is a participant
flow diagram of the register aggregates; Figure 3 charts the age
gradient (initial dropout vs non-return by band) with a
validator-passing two-hue palette. Callouts added in III.B and IV.

Co-Authored-By: Claude Fable 5 <noreply@anthropic.com>
Claude-Session: https://claude.ai/code/session_01KoT3i8geZspYBMMKVYJUTG
</commit_message>
<xml_diff>
--- a/docs/papers/Paper3_R3_Aligned_V24.docx
+++ b/docs/papers/Paper3_R3_Aligned_V24.docx
@@ -129,7 +129,48 @@
     </w:p>
     <w:p>
       <w:r>
-        <w:t>Relative to the coupled deployment of [2], the participant-facing clinical attachment was removed as a package, and the removal was implemented by re-platforming: the game was ported to an HTML build and sent to participants by e-mail, so that play occurred away from the clinical station altogether. The package comprised recruitment language (a coordination challenge, with no medical or fall-prevention vocabulary); the absence of any pre-session clinical scan; the absence of clinical labels, and of any clinical station or setting; and the absence of participant-facing clinical outputs, with no balance score or risk index shown at any point. The skiing mechanic, five-attempt rule and session structure were retained in the ported build; the pressure-panel apparatus and in-person supervision were not — participants played unsupervised on their own computers using a trackpad, arrow keys or, where available, a foot-pad sensor. Participant-level clinical balance telemetry was not collected. Because cohort, setting, platform, input device, supervision and recruitment channel also differed, the design estimates the combined association of the decoupled condition and its context with behaviour.</w:t>
+        <w:t>Relative to the coupled deployment of [2], the participant-facing clinical attachment was removed as a package, and the removal was implemented by re-platforming: the game was ported to an HTML build and sent to participants by e-mail, so that play occurred away from the clinical station altogether. The package comprised recruitment language (a coordination challenge, with no medical or fall-prevention vocabulary); the absence of any pre-session clinical scan; the absence of clinical labels, and of any clinical station or setting; and the absence of participant-facing clinical outputs, with no balance score or risk index shown at any point. The skiing mechanic, five-attempt rule and session structure were retained in the ported build; the pressure-panel apparatus and in-person supervision were not — participants played unsupervised on their own computers using a trackpad, arrow keys or, where available, a foot-pad sensor. Participant-level clinical balance telemetry was not collected. Because cohort, setting, platform, input device, supervision and recruitment channel also differed, the design estimates the combined association of the decoupled condition and its context with behaviour. Figure 1 shows the ported build at five staged difficulty levels.</w:t>
+      </w:r>
+    </w:p>
+    <w:p>
+      <w:r>
+        <w:drawing>
+          <wp:inline xmlns:a="http://schemas.openxmlformats.org/drawingml/2006/main" xmlns:pic="http://schemas.openxmlformats.org/drawingml/2006/picture">
+            <wp:extent cx="5486400" cy="6346845"/>
+            <wp:docPr id="1" name="Picture 1"/>
+            <wp:cNvGraphicFramePr>
+              <a:graphicFrameLocks noChangeAspect="1"/>
+            </wp:cNvGraphicFramePr>
+            <a:graphic>
+              <a:graphicData uri="http://schemas.openxmlformats.org/drawingml/2006/picture">
+                <pic:pic>
+                  <pic:nvPicPr>
+                    <pic:cNvPr id="0" name="paper3_fig1_game.png"/>
+                    <pic:cNvPicPr/>
+                  </pic:nvPicPr>
+                  <pic:blipFill>
+                    <a:blip r:embed="rId9"/>
+                    <a:stretch>
+                      <a:fillRect/>
+                    </a:stretch>
+                  </pic:blipFill>
+                  <pic:spPr>
+                    <a:xfrm>
+                      <a:off x="0" y="0"/>
+                      <a:ext cx="5486400" cy="6346845"/>
+                    </a:xfrm>
+                    <a:prstGeom prst="rect"/>
+                  </pic:spPr>
+                </pic:pic>
+              </a:graphicData>
+            </a:graphic>
+          </wp:inline>
+        </w:drawing>
+      </w:r>
+    </w:p>
+    <w:p>
+      <w:r>
+        <w:t>Figure 1. The coordination-challenge game (archived HTML build, Stage-3 design lineage) at staged difficulty multipliers x0.40-x1.40. Obstacle density and scroll speed scale with the difficulty multiplier; the interface carries no clinical labels, scores or risk outputs.</w:t>
       </w:r>
     </w:p>
     <w:p>
@@ -168,7 +209,7 @@
     </w:p>
     <w:p>
       <w:r>
-        <w:t>Overall, 23 of 120 participants (19.2%) dropped out before completing the protocol; 15 of the 23 (65.2%; 95% CI 44.9-81.2%) returned voluntarily; 8 (6.7%) did not return, giving end-of-window retention of 93.3% (Table 1).</w:t>
+        <w:t>Overall, 23 of 120 participants (19.2%) dropped out before completing the protocol; 15 of the 23 (65.2%; 95% CI 44.9-81.2%) returned voluntarily; 8 (6.7%) did not return, giving end-of-window retention of 93.3% (Table 1). Figure 2 traces the flow.</w:t>
       </w:r>
     </w:p>
     <w:p>
@@ -178,6 +219,47 @@
           <w:sz w:val="18"/>
         </w:rPr>
         <w:t>Table 1. Overall engagement and dropout (N = 120).</w:t>
+      </w:r>
+    </w:p>
+    <w:p>
+      <w:r>
+        <w:drawing>
+          <wp:inline xmlns:a="http://schemas.openxmlformats.org/drawingml/2006/main" xmlns:pic="http://schemas.openxmlformats.org/drawingml/2006/picture">
+            <wp:extent cx="5303520" cy="3290996"/>
+            <wp:docPr id="2" name="Picture 2"/>
+            <wp:cNvGraphicFramePr>
+              <a:graphicFrameLocks noChangeAspect="1"/>
+            </wp:cNvGraphicFramePr>
+            <a:graphic>
+              <a:graphicData uri="http://schemas.openxmlformats.org/drawingml/2006/picture">
+                <pic:pic>
+                  <pic:nvPicPr>
+                    <pic:cNvPr id="0" name="paper3_fig2_flow.png"/>
+                    <pic:cNvPicPr/>
+                  </pic:nvPicPr>
+                  <pic:blipFill>
+                    <a:blip r:embed="rId10"/>
+                    <a:stretch>
+                      <a:fillRect/>
+                    </a:stretch>
+                  </pic:blipFill>
+                  <pic:spPr>
+                    <a:xfrm>
+                      <a:off x="0" y="0"/>
+                      <a:ext cx="5303520" cy="3290996"/>
+                    </a:xfrm>
+                    <a:prstGeom prst="rect"/>
+                  </pic:spPr>
+                </pic:pic>
+              </a:graphicData>
+            </a:graphic>
+          </wp:inline>
+        </w:drawing>
+      </w:r>
+    </w:p>
+    <w:p>
+      <w:r>
+        <w:t>Figure 2. Participant flow in the preliminary aggregate record (N = 120). Voluntary return after initial dropout is the study's central behavioural outcome; in the coupled Stage-2 deployment the corresponding return count was zero.</w:t>
       </w:r>
     </w:p>
     <w:tbl>
@@ -402,7 +484,7 @@
     </w:tbl>
     <w:p>
       <w:r>
-        <w:t>Engagement was strongly age-stratified (Table 2). Initial dropout rose from 0.0% (0 of 38) in the 25-44 band through 17.1% (7 of 41) in the 45-64 band to 39.0% (16 of 41) in the 65-80 band (chi-square across bands p &lt; 0.001; 25-44 versus 65-80, Fisher's exact p &lt; 0.0001), nullifying H0-age for initial engagement. Observed non-return, by contrast, converged to low levels in every band: 0.0%, 4.9% and 14.6% (95% CI 6.9-28.4% in the 65-80 band), because most older dropouts came back: 10 of 16 in the 65-80 band (62.5%; 95% CI 38.6-81.5%) against 0 of 21 observed re-engagements in the coupled deployment of [2].</w:t>
+        <w:t>Engagement was strongly age-stratified (Table 2). Initial dropout rose from 0.0% (0 of 38) in the 25-44 band through 17.1% (7 of 41) in the 45-64 band to 39.0% (16 of 41) in the 65-80 band (chi-square across bands p &lt; 0.001; 25-44 versus 65-80, Fisher's exact p &lt; 0.0001), nullifying H0-age for initial engagement. Observed non-return, by contrast, converged to low levels in every band: 0.0%, 4.9% and 14.6% (95% CI 6.9-28.4% in the 65-80 band), because most older dropouts came back: 10 of 16 in the 65-80 band (62.5%; 95% CI 38.6-81.5%) against 0 of 21 observed re-engagements in the coupled deployment of [2]. Figure 3 shows the divergence of the two rates.</w:t>
       </w:r>
     </w:p>
     <w:p>
@@ -412,6 +494,47 @@
           <w:sz w:val="18"/>
         </w:rPr>
         <w:t>Table 2. Age-stratified engagement.</w:t>
+      </w:r>
+    </w:p>
+    <w:p>
+      <w:r>
+        <w:drawing>
+          <wp:inline xmlns:a="http://schemas.openxmlformats.org/drawingml/2006/main" xmlns:pic="http://schemas.openxmlformats.org/drawingml/2006/picture">
+            <wp:extent cx="4206240" cy="2840541"/>
+            <wp:docPr id="3" name="Picture 3"/>
+            <wp:cNvGraphicFramePr>
+              <a:graphicFrameLocks noChangeAspect="1"/>
+            </wp:cNvGraphicFramePr>
+            <a:graphic>
+              <a:graphicData uri="http://schemas.openxmlformats.org/drawingml/2006/picture">
+                <pic:pic>
+                  <pic:nvPicPr>
+                    <pic:cNvPr id="0" name="paper3_fig3_age_gradient.png"/>
+                    <pic:cNvPicPr/>
+                  </pic:nvPicPr>
+                  <pic:blipFill>
+                    <a:blip r:embed="rId11"/>
+                    <a:stretch>
+                      <a:fillRect/>
+                    </a:stretch>
+                  </pic:blipFill>
+                  <pic:spPr>
+                    <a:xfrm>
+                      <a:off x="0" y="0"/>
+                      <a:ext cx="4206240" cy="2840541"/>
+                    </a:xfrm>
+                    <a:prstGeom prst="rect"/>
+                  </pic:spPr>
+                </pic:pic>
+              </a:graphicData>
+            </a:graphic>
+          </wp:inline>
+        </w:drawing>
+      </w:r>
+    </w:p>
+    <w:p>
+      <w:r>
+        <w:t>Figure 3. The age gradient: initial dropout climbs steeply with age (0.0%, 17.1%, 39.0%) while non-return at the window end stays low in every band (0.0%, 4.9%, 14.6%) - most older participants who drop out come back under the decoupled condition.</w:t>
       </w:r>
     </w:p>
     <w:tbl>

</xml_diff>

<commit_message>
V27: add Stage-3 recruitment rationale to thesis 6.4 and Paper 3
Per the author: the Stage-2 facility was deliberately not re-used (prior
exposure to the coupled system would contaminate a first-contact test of
the decoupled frame), and distribution extended via onward snowball
forwarding to participants unknown to the author, reducing
personal-obligation bias.

Co-Authored-By: Claude Fable 5 <noreply@anthropic.com>
Claude-Session: https://claude.ai/code/session_01KoT3i8geZspYBMMKVYJUTG
</commit_message>
<xml_diff>
--- a/docs/papers/Paper3_R3_Aligned_V24.docx
+++ b/docs/papers/Paper3_R3_Aligned_V24.docx
@@ -184,6 +184,11 @@
     <w:p>
       <w:r>
         <w:t>One hundred and twenty community-dwelling adults aged 25-80 were recruited through the authors' Hong Kong-based networks — work contacts, a charity community network, university support channels and working peers in medical centres: 38 aged 25-44, 41 aged 45-64 and 41 aged 65-80; 48 men and 72 women; all reported high-school education or above. Recruitment materials described a coordination challenge and used no medical or fall-prevention vocabulary. Recruiting three age bands builds the comparison group into the study and licenses a second null hypothesis, H0-age: that under the decoupled condition there is no difference between age groups. Data collection is complete: each participant returned, by e-mail, the results file logged by the HTML build (including the session score and game-logged data) together with their questionnaire responses. This paper reports the preliminary aggregate record compiled from those returns; participant-level compilation continues beyond it. Participation was voluntary and unpaid, by informed, implied consent: the distribution e-mails explained the purpose of the game and questionnaire and the use of replies, and returning the results file and responses constituted consent; no written consent instrument was administered, which is acknowledged in Section VII. Identities were separated from the analysed records, which retain only a participant code, age band, gender and education.</w:t>
+      </w:r>
+    </w:p>
+    <w:p>
+      <w:r>
+        <w:t>Two recruitment decisions were deliberate. The Stage-2 facility of [2] was not re-used: its residents already carried direct experience of the coupled system, and prior exposure would have contaminated a first-contact test of the decoupled frame, so a separate cohort was a design choice rather than only a constraint. Distribution also extended beyond the authors' immediate circle through onward (snowball) forwarding by the receiving organisations and contacts, so that a portion of participants were personally unknown to the authors, reducing the risk that participation reflected personal obligation to the researcher.</w:t>
       </w:r>
     </w:p>
     <w:p>

</xml_diff>

<commit_message>
V35: correct recruitment-language claims per archived distributor invitations
Genuine Mail screenshots of the distributor-tier invitations (Daisy:
ages 18-45; Kevin: 45+) show the invitation disclosed the research
context including the fall-risk origin while presenting the game as a
purely-fun coordination game. Thesis (overview, 6.3, 6.4) and Paper 3
(III.B, III.C, VII) corrected: decoupling operated at the artefact
level, not by concealment — and the reading is sharpened, since
participants who knew the origin still returned after failure.
Screenshots archived as the G.5 distributor-tier record; date-visible
versions, the under-25 question, and end-participant wording still
pending.

Co-Authored-By: Claude Fable 5 <noreply@anthropic.com>
Claude-Session: https://claude.ai/code/session_01KoT3i8geZspYBMMKVYJUTG
</commit_message>
<xml_diff>
--- a/docs/papers/Paper3_R3_Aligned_V24.docx
+++ b/docs/papers/Paper3_R3_Aligned_V24.docx
@@ -129,7 +129,7 @@
     </w:p>
     <w:p>
       <w:r>
-        <w:t>Relative to the coupled deployment of [2], the participant-facing clinical attachment was removed as a package, and the removal was implemented by re-platforming: the game was ported to an HTML build and sent to participants by e-mail, so that play occurred away from the clinical station altogether. The package comprised recruitment language (a coordination challenge, with no medical or fall-prevention vocabulary); the absence of any pre-session clinical scan; the absence of clinical labels, and of any clinical station or setting; and the absence of participant-facing clinical outputs, with no balance score or risk index shown at any point. The skiing mechanic, five-attempt rule and session structure were retained in the ported build; the pressure-panel apparatus and in-person supervision were not — participants played unsupervised on their own computers using a trackpad, arrow keys or, where available, a foot-pad sensor. In-run difficulty adaptation in the ported build operated through the game's built-in rule agent; no external model calls are possible from a distributed HTML file, so no large-language-model adaptation operated in any Stage-3 session. Participant-level clinical balance telemetry was not collected. Because cohort, setting, platform, input device, supervision and recruitment channel also differed, the design estimates the combined association of the decoupled condition and its context with behaviour. Figure 1 shows the ported build at five staged difficulty levels.</w:t>
+        <w:t>Relative to the coupled deployment of [2], the participant-facing clinical attachment was removed as a package, and the removal was implemented by re-platforming: the game was ported to an HTML build and sent to participants by e-mail, so that play occurred away from the clinical station altogether. The package comprised presentation of the activity as a purely-fun coordination game (the invitation disclosed the doctoral research context, including its fall-risk origin, but the game and its instructions carried no medical or fall-prevention vocabulary); the absence of any pre-session clinical scan; the absence of clinical labels, and of any clinical station or setting; and the absence of participant-facing clinical outputs, with no balance score or risk index shown at any point. The skiing mechanic, five-attempt rule and session structure were retained in the ported build; the pressure-panel apparatus and in-person supervision were not — participants played unsupervised on their own computers using a trackpad, arrow keys or, where available, a foot-pad sensor. In-run difficulty adaptation in the ported build operated through the game's built-in rule agent; no external model calls are possible from a distributed HTML file, so no large-language-model adaptation operated in any Stage-3 session. Participant-level clinical balance telemetry was not collected. Because cohort, setting, platform, input device, supervision and recruitment channel also differed, the design estimates the combined association of the decoupled condition and its context with behaviour. Figure 1 shows the ported build at five staged difficulty levels.</w:t>
       </w:r>
     </w:p>
     <w:p>
@@ -183,7 +183,7 @@
     </w:p>
     <w:p>
       <w:r>
-        <w:t>One hundred and twenty community-dwelling adults aged 25-80 were recruited through the authors' Hong Kong-based networks — work contacts, a charity community network, university support channels and working peers in medical centres: 38 aged 25-44, 41 aged 45-64 and 41 aged 65-80; 48 men and 72 women; all reported high-school education or above. Recruitment materials described a coordination challenge and used no medical or fall-prevention vocabulary. Recruiting three age bands builds the comparison group into the study and licenses a second null hypothesis, H0-age: that under the decoupled condition there is no difference between age groups. Data collection is complete: each participant returned, by e-mail, the results file logged by the HTML build (including the session score and game-logged data) together with their questionnaire responses. This paper reports the preliminary aggregate record compiled from those returns; participant-level compilation continues beyond it. Participation was voluntary and unpaid, by informed, implied consent: the distribution e-mails explained the purpose of the game and questionnaire and the use of replies, and returning the results file and responses constituted consent; no written consent instrument was administered, which is acknowledged in Section VII. Identities were separated from the analysed records, which retain only a participant code, age band, gender and education.</w:t>
+        <w:t>One hundred and twenty community-dwelling adults aged 25-80 were recruited through the authors' Hong Kong-based networks — work contacts, a charity community network, university support channels and working peers in medical centres: 38 aged 25-44, 41 aged 45-64 and 41 aged 65-80; 48 men and 72 women; all reported high-school education or above. The invitation e-mails disclosed the research context, including the programme's fall-risk origin, while presenting the activity itself as a purely-fun coordination game; the game and its instructions used no medical or fall-prevention vocabulary. Recruiting three age bands builds the comparison group into the study and licenses a second null hypothesis, H0-age: that under the decoupled condition there is no difference between age groups. Data collection is complete: each participant returned, by e-mail, the results file logged by the HTML build (including the session score and game-logged data) together with their questionnaire responses. This paper reports the preliminary aggregate record compiled from those returns; participant-level compilation continues beyond it. Participation was voluntary and unpaid, by informed, implied consent: the distribution e-mails explained the purpose of the game and questionnaire and the use of replies, and returning the results file and responses constituted consent; no written consent instrument was administered, which is acknowledged in Section VII. Identities were separated from the analysed records, which retain only a participant code, age band, gender and education.</w:t>
       </w:r>
     </w:p>
     <w:p>
@@ -1287,7 +1287,7 @@
     </w:p>
     <w:p>
       <w:r>
-        <w:t>The comparison with [2] is between-cycle and between-cohort, without randomisation; the decoupling is a multi-component package that includes a change of platform, input device, setting and supervision (an e-mailed HTML build played unsupervised on participants' own computers, rather than the supervised pressure-panel station of [2]); the proposed mechanisms (endowment, mental accounting, stereotype threat) were not directly measured; regular-use intention is stated, not longitudinal behaviour; this paper reports the preliminary aggregate record compiled from participants' e-mailed returns, with participant-level compilation continuing beyond it; input device varied by participant and was not centrally standardised; remote unsupervised play means session conditions were not controlled; participants were volunteers in Chinese-cultural settings, and generalisation beyond these contexts is untested; consent was informed but implied rather than written; and no clinical telemetry was collected, so no claim about clinical outcomes under decoupling is made.</w:t>
+        <w:t>The comparison with [2] is between-cycle and between-cohort, without randomisation; the decoupling is a multi-component package that includes a change of platform, input device, setting and supervision (an e-mailed HTML build played unsupervised on participants' own computers, rather than the supervised pressure-panel station of [2]); the proposed mechanisms (endowment, mental accounting, stereotype threat) were not directly measured; regular-use intention is stated, not longitudinal behaviour; this paper reports the preliminary aggregate record compiled from participants' e-mailed returns, with participant-level compilation continuing beyond it; input device varied by participant and was not centrally standardised; remote unsupervised play means session conditions were not controlled; participants were volunteers in Chinese-cultural settings, and generalisation beyond these contexts is untested; consent was informed but implied rather than written; the invitation disclosed the programme's fall-risk research origin, so Stage 3 tests artefact-level decoupling rather than concealment of purpose; and no clinical telemetry was collected, so no claim about clinical outcomes under decoupling is made.</w:t>
       </w:r>
     </w:p>
     <w:p>

</xml_diff>

<commit_message>
HSESC approval received: propagate HSEARS20260805008 into thesis V36 and all three manuscripts
Approval e-mail to PI Prof. Cheung archived (Non-Clinical Acad., DISE, submitted 06-Aug-2026). V36 inserts the approval statement in section 3.4 and adds the Stage-2 consent-as-conducted paragraph the approved application licensed. Ethics track no longer blocking; JIKM submission unblocked pending supervisor go-ahead and the SS-293 check.

Co-Authored-By: Claude Fable 5 <noreply@anthropic.com>
Claude-Session: https://claude.ai/code/session_01KoT3i8geZspYBMMKVYJUTG
</commit_message>
<xml_diff>
--- a/docs/papers/Paper3_R3_Aligned_V24.docx
+++ b/docs/papers/Paper3_R3_Aligned_V24.docx
@@ -183,10 +183,7 @@
     </w:p>
     <w:p>
       <w:r>
-        <w:t>One hundred and twenty community-dwelling adults aged 25-80 were recruited through the authors' Hong Kong-based networks — work contacts, a charity community network, university support channels and working peers in medical centres: 38 aged 25-44, 41 aged 45-64 and 41 aged 65-80; 48 men and 72 women; all reported high-school education or above. The invitation e-mails disclosed the research context, including the programme's fall-risk origin, while presenting the activity itself as a purely-fun coordination game; the game and its instructions used no medical or fall-prevention vocabulary. Recruiting three age bands builds the comparison group into the study and licenses a second null hypothesis, H0-age: that under the decoupled condition there is no difference between age groups. Data collection is complete: each participant returned, by e-mail, the results file logged by the HTML build (including the session score and game-logged data) together with their questionnaire responses. This paper reports the preliminary aggregate record compiled from those returns; participant-level compilation continues beyond it. Participation was voluntary and unpaid, by informed, implied consent: the distribution e-mails explained the purpose of the game and questionnaire and the use of replies, and returning the results file and responses constituted consent; no written consent instrument was administered, which is acknowledged in Section VII. Identities were separated from the analysed records, which retain only a participant code, age band, gender and education.</w:t>
-      </w:r>
-      <w:r>
-        <w:t xml:space="preserve"> The programme operates under the ethics policy of The Hong Kong Polytechnic University; an application covering the programme has been submitted to the university's Human Subjects Ethics Sub-Committee and is under review (application HSEARS20260805008).</w:t>
+        <w:t>One hundred and twenty community-dwelling adults aged 25-80 were recruited through the authors' Hong Kong-based networks — work contacts, a charity community network, university support channels and working peers in medical centres: 38 aged 25-44, 41 aged 45-64 and 41 aged 65-80; 48 men and 72 women; all reported high-school education or above. The invitation e-mails disclosed the research context, including the programme's fall-risk origin, while presenting the activity itself as a purely-fun coordination game; the game and its instructions used no medical or fall-prevention vocabulary. Recruiting three age bands builds the comparison group into the study and licenses a second null hypothesis, H0-age: that under the decoupled condition there is no difference between age groups. Data collection is complete: each participant returned, by e-mail, the results file logged by the HTML build (including the session score and game-logged data) together with their questionnaire responses. This paper reports the preliminary aggregate record compiled from those returns; participant-level compilation continues beyond it. Participation was voluntary and unpaid, by informed, implied consent: the distribution e-mails explained the purpose of the game and questionnaire and the use of replies, and returning the results file and responses constituted consent; no written consent instrument was administered, which is acknowledged in Section VII. Identities were separated from the analysed records, which retain only a participant code, age band, gender and education. The programme operates under the ethics policy of The Hong Kong Polytechnic University; the programme was approved by the university's Human Subjects Ethics Sub-Committee (application reference HSEARS20260805008; Principal Investigator: Prof. C. F. Cheung; approved August 2026).</w:t>
       </w:r>
     </w:p>
     <w:p>

</xml_diff>